<commit_message>
docs(sem04): actualizar agile product backlog con capturas reales de interfaz tomadas con playwright
</commit_message>
<xml_diff>
--- a/docs/entregables/SEM04/SCRUM_Agile-Product-Backlog.docx
+++ b/docs/entregables/SEM04/SCRUM_Agile-Product-Backlog.docx
@@ -1718,7 +1718,7 @@
         <w:jc w:val="left"/>
       </w:pPr>
       <w:r>
-        <w:t>A continuación, se detalla la formulación formal de las Historias de Usuario, acompañada de sus Criterios de Aceptación bajo el estándar Gherkin (Dado que / Cuando / Entonces), su valor de negocio para la empresa y las representaciones visuales (wireframes/mockups de interfaz) diseñadas para la arquitectura web en Angular 21, conforme a las directivas del curso:</w:t>
+        <w:t>A continuación, se detalla la formulación formal de las Historias de Usuario, acompañada de sus Criterios de Aceptación bajo el estándar Gherkin (Dado que / Cuando / Entonces), su valor de negocio para la empresa y las representaciones visuales (capturas de pantalla de la interfaz web en Angular 21) diseñadas para la arquitectura web en Angular 21, conforme a las directivas del curso:</w:t>
       </w:r>
     </w:p>
     <w:p>
@@ -1805,7 +1805,7 @@
           <w:color w:val="464646"/>
           <w:sz w:val="17"/>
         </w:rPr>
-        <w:t>Figura 1. Wireframe de Interfaz: Inicio de Sesión y Control de Roles Operativos (RBAC)</w:t>
+        <w:t>Figura 1. Captura de Interfaz: Inicio de Sesión y Control de Acceso por Roles (RBAC)</w:t>
       </w:r>
     </w:p>
     <w:p>
@@ -1892,7 +1892,7 @@
           <w:color w:val="464646"/>
           <w:sz w:val="17"/>
         </w:rPr>
-        <w:t>Figura 2. Wireframe de Interfaz: Talonario Comercial Digital, Cotizador y Reserva de Stock</w:t>
+        <w:t>Figura 2. Captura de Interfaz: Talonario Comercial Digital, Cotizador y Reserva de Stock</w:t>
       </w:r>
     </w:p>
     <w:p>
@@ -1979,7 +1979,7 @@
           <w:color w:val="464646"/>
           <w:sz w:val="17"/>
         </w:rPr>
-        <w:t>Figura 3. Wireframe de Interfaz: Módulo de Producción y Control de Taller</w:t>
+        <w:t>Figura 3. Captura de Interfaz: Módulo de Producción y Control de Taller</w:t>
       </w:r>
     </w:p>
     <w:p>
@@ -2066,7 +2066,7 @@
           <w:color w:val="464646"/>
           <w:sz w:val="17"/>
         </w:rPr>
-        <w:t>Figura 4. Wireframe de Interfaz: Módulo de Cobranzas y Candado Digital de Seguridad Operativa</w:t>
+        <w:t>Figura 4. Captura de Interfaz: Módulo de Cobranzas, Arqueo de Caja Dual y Candado Digital</w:t>
       </w:r>
     </w:p>
     <w:p>
@@ -2147,7 +2147,7 @@
         <w:jc w:val="center"/>
       </w:pPr>
       <w:r>
-        <w:t>Figura 5. Wireframe de Interfaz: Dashboard Gerencial BI y Modelo Predictivo de Insumos IA</w:t>
+        <w:t>Figura 5. Captura de Interfaz: Dashboard Gerencial BI y Análisis Financiero Operativo</w:t>
       </w:r>
     </w:p>
     <w:p>
@@ -2339,7 +2339,7 @@
           <w:color w:val="000000"/>
           <w:sz w:val="20"/>
         </w:rPr>
-        <w:t>Por medio de la presente, la contraparte institucional de la empresa Impresos Trujillo E.I.R.L. en calidad de Product Owner y Sponsor del proyecto, manifiesta su total conocimiento y aprobación del inventario de Historias de Usuario, su orden de priorización, las estimaciones relativas de esfuerzo y los wireframes de interfaz acordados para el desarrollo iterativo del sistema web:</w:t>
+        <w:t>Por medio de la presente, la contraparte institucional de la empresa Impresos Trujillo E.I.R.L. en calidad de Product Owner y Sponsor del proyecto, manifiesta su total conocimiento y aprobación del inventario de Historias de Usuario, su orden de priorización, las estimaciones relativas de esfuerzo y las interfaces del sistema acordadas para el desarrollo iterativo del sistema web:</w:t>
       </w:r>
     </w:p>
     <w:tbl>

</xml_diff>